<commit_message>
Warn when PHP is bound to loopback from a stale winvetsim.ini
winvetsim.ini lives in the data directory, is created once from the
compiled defaults, and is never updated by any installer - so every machine
set up before DEFAULT_PHP_SERVER_ADDRESS became 0.0.0.0 still pins PHP to
127.0.0.1 on every upgrade. This silently breaks sim-remote and remote
instructor access, and is invisible locally because the Electron window uses
127.0.0.1 and works fine.

Log a warning naming the file and the fix. Not auto-corrected: an admin may
want loopback-only. Documented in CLAUDE.md and the Windows guide.
</commit_message>
<xml_diff>
--- a/OpenVetSim_v2.6.2_Windows_Build_Guide.docx
+++ b/OpenVetSim_v2.6.2_Windows_Build_Guide.docx
@@ -676,7 +676,7 @@
                 <w:sz w:val="19"/>
                 <w:rFonts w:ascii="Consolas" w:hAnsi="Consolas"/>
               </w:rPr>
-              <w:t>Part 7</w:t>
+              <w:t>Part 6b</w:t>
             </w:r>
           </w:p>
         </w:tc>
@@ -699,7 +699,7 @@
               <w:rPr>
                 <w:sz w:val="19"/>
               </w:rPr>
-              <w:t>If something is wrong: roll back</w:t>
+              <w:t>Optional: instructor interface from another PC</w:t>
             </w:r>
           </w:p>
         </w:tc>
@@ -722,7 +722,7 @@
               <w:rPr>
                 <w:sz w:val="19"/>
               </w:rPr>
-              <w:t>as needed</w:t>
+              <w:t>10 min</w:t>
             </w:r>
           </w:p>
         </w:tc>
@@ -750,7 +750,7 @@
                 <w:sz w:val="19"/>
                 <w:rFonts w:ascii="Consolas" w:hAnsi="Consolas"/>
               </w:rPr>
-              <w:t>Part 8</w:t>
+              <w:t>Part 7</w:t>
             </w:r>
           </w:p>
         </w:tc>
@@ -774,6 +774,80 @@
               <w:rPr>
                 <w:sz w:val="19"/>
               </w:rPr>
+              <w:t>If something is wrong: roll back</w:t>
+            </w:r>
+          </w:p>
+        </w:tc>
+        <w:tc>
+          <w:tcPr>
+            <w:tcW w:type="dxa" w:w="1584"/>
+            <w:shd w:val="clear" w:fill="F7F9FC"/>
+            <w:tcBorders>
+              <w:top w:val="single" w:sz="2" w:color="D9D9D9"/>
+              <w:bottom w:val="single" w:sz="2" w:color="D9D9D9"/>
+              <w:left w:val="single" w:sz="2" w:color="D9D9D9"/>
+              <w:right w:val="single" w:sz="2" w:color="D9D9D9"/>
+            </w:tcBorders>
+          </w:tcPr>
+          <w:p>
+            <w:pPr>
+              <w:spacing w:after="0"/>
+            </w:pPr>
+            <w:r/>
+            <w:r>
+              <w:rPr>
+                <w:sz w:val="19"/>
+              </w:rPr>
+              <w:t>as needed</w:t>
+            </w:r>
+          </w:p>
+        </w:tc>
+      </w:tr>
+      <w:tr>
+        <w:tc>
+          <w:tcPr>
+            <w:tcW w:type="dxa" w:w="1296"/>
+            <w:tcBorders>
+              <w:top w:val="single" w:sz="2" w:color="D9D9D9"/>
+              <w:bottom w:val="single" w:sz="2" w:color="D9D9D9"/>
+              <w:left w:val="single" w:sz="2" w:color="D9D9D9"/>
+              <w:right w:val="single" w:sz="2" w:color="D9D9D9"/>
+            </w:tcBorders>
+          </w:tcPr>
+          <w:p>
+            <w:pPr>
+              <w:spacing w:after="0"/>
+            </w:pPr>
+            <w:r/>
+            <w:r>
+              <w:rPr>
+                <w:rFonts w:ascii="Consolas" w:hAnsi="Consolas"/>
+                <w:sz w:val="19"/>
+                <w:rFonts w:ascii="Consolas" w:hAnsi="Consolas"/>
+              </w:rPr>
+              <w:t>Part 8</w:t>
+            </w:r>
+          </w:p>
+        </w:tc>
+        <w:tc>
+          <w:tcPr>
+            <w:tcW w:type="dxa" w:w="6480"/>
+            <w:tcBorders>
+              <w:top w:val="single" w:sz="2" w:color="D9D9D9"/>
+              <w:bottom w:val="single" w:sz="2" w:color="D9D9D9"/>
+              <w:left w:val="single" w:sz="2" w:color="D9D9D9"/>
+              <w:right w:val="single" w:sz="2" w:color="D9D9D9"/>
+            </w:tcBorders>
+          </w:tcPr>
+          <w:p>
+            <w:pPr>
+              <w:spacing w:after="0"/>
+            </w:pPr>
+            <w:r/>
+            <w:r>
+              <w:rPr>
+                <w:sz w:val="19"/>
+              </w:rPr>
               <w:t>If it works: publish the release</w:t>
             </w:r>
           </w:p>
@@ -781,7 +855,6 @@
         <w:tc>
           <w:tcPr>
             <w:tcW w:type="dxa" w:w="1584"/>
-            <w:shd w:val="clear" w:fill="F7F9FC"/>
             <w:tcBorders>
               <w:top w:val="single" w:sz="2" w:color="D9D9D9"/>
               <w:bottom w:val="single" w:sz="2" w:color="D9D9D9"/>
@@ -1146,7 +1219,7 @@
                 <w:sz w:val="18"/>
                 <w:rFonts w:ascii="Consolas" w:hAnsi="Consolas"/>
               </w:rPr>
-              <w:t>cd $env:USERPROFILE\Documents\"Claude OVS"</w:t>
+              <w:t>cd "$env:USERPROFILE\Documents\Claude OVS"</w:t>
             </w:r>
           </w:p>
           <w:p>
@@ -1267,7 +1340,7 @@
                 <w:sz w:val="18"/>
                 <w:rFonts w:ascii="Consolas" w:hAnsi="Consolas"/>
               </w:rPr>
-              <w:t>findstr version OpenVetSim-App\package.json</w:t>
+              <w:t>Select-String OpenVetSim-App\package.json -Pattern '\"version\"'</w:t>
             </w:r>
           </w:p>
           <w:p>
@@ -1280,7 +1353,7 @@
                 <w:sz w:val="18"/>
                 <w:rFonts w:ascii="Consolas" w:hAnsi="Consolas"/>
               </w:rPr>
-              <w:t>findstr /C:"sim_monotonic_msec" OpenVetSim\platform.h | find /c "sim_monotonic_msec"</w:t>
+              <w:t>(Select-String OpenVetSim\platform.h  -Pattern 'sim_monotonic_msec' -SimpleMatch).Count</w:t>
             </w:r>
           </w:p>
           <w:p>
@@ -1293,7 +1366,20 @@
                 <w:sz w:val="18"/>
                 <w:rFonts w:ascii="Consolas" w:hAnsi="Consolas"/>
               </w:rPr>
-              <w:t>findstr /C:"drainListeners" OpenVetSim\pulse.cpp | find /c "drainListeners"</w:t>
+              <w:t>(Select-String OpenVetSim\pulse.cpp   -Pattern 'drainListeners'     -SimpleMatch).Count</w:t>
+            </w:r>
+          </w:p>
+          <w:p>
+            <w:pPr>
+              <w:spacing w:after="0" w:line="240" w:lineRule="auto"/>
+            </w:pPr>
+            <w:r>
+              <w:rPr>
+                <w:rFonts w:ascii="Consolas" w:hAnsi="Consolas"/>
+                <w:sz w:val="18"/>
+                <w:rFonts w:ascii="Consolas" w:hAnsi="Consolas"/>
+              </w:rPr>
+              <w:t>(Select-String OpenVetSim-App\build\installer.nsh -Pattern 'scenarios-backup' -SimpleMatch).Count</w:t>
             </w:r>
           </w:p>
         </w:tc>
@@ -1325,7 +1411,7 @@
         <w:rPr>
           <w:sz w:val="21"/>
         </w:rPr>
-        <w:t>74b113d Bump version to 2.6.2</w:t>
+        <w:t>A commit message mentioning the installer scenario fix</w:t>
       </w:r>
     </w:p>
     <w:p>
@@ -1349,7 +1435,7 @@
         <w:rPr>
           <w:sz w:val="21"/>
         </w:rPr>
-        <w:t>3   (or more)</w:t>
+        <w:t>3   — the beat timing fix</w:t>
       </w:r>
     </w:p>
     <w:p>
@@ -1361,13 +1447,38 @@
         <w:rPr>
           <w:sz w:val="21"/>
         </w:rPr>
-        <w:t>4   (or more)</w:t>
+        <w:t>4   — the socket drain fix</w:t>
       </w:r>
     </w:p>
     <w:p>
       <w:pPr>
+        <w:pStyle w:val="ListBullet"/>
+        <w:spacing w:after="60"/>
+      </w:pPr>
+      <w:r>
+        <w:rPr>
+          <w:sz w:val="21"/>
+        </w:rPr>
+        <w:t>2   — the installer scenario-preservation fix</w:t>
+      </w:r>
+    </w:p>
+    <w:p>
+      <w:pPr>
         <w:spacing w:after="80"/>
       </w:pPr>
+    </w:p>
+    <w:p>
+      <w:pPr>
+        <w:spacing w:after="80"/>
+      </w:pPr>
+      <w:r>
+        <w:rPr>
+          <w:b w:val="0"/>
+          <w:i/>
+          <w:color w:val="595959"/>
+        </w:rPr>
+        <w:t>These are PowerShell commands. The older findstr | find /c form does not work in PowerShell — it returns “FIND: Parameter format not correct”.</w:t>
+      </w:r>
     </w:p>
     <w:tbl>
       <w:tblPr>
@@ -1405,13 +1516,24 @@
           </w:p>
           <w:p>
             <w:pPr>
+              <w:spacing w:after="60"/>
+            </w:pPr>
+            <w:r>
+              <w:rPr>
+                <w:sz w:val="20"/>
+              </w:rPr>
+              <w:t>A count of 0, or a version of 2.6.1, means you are not on the right code. Run git branch --show-current and confirm it says beat-timing-fixes. Do not continue until all five checks pass.</w:t>
+            </w:r>
+          </w:p>
+          <w:p>
+            <w:pPr>
               <w:spacing w:after="0"/>
             </w:pPr>
             <w:r>
               <w:rPr>
                 <w:sz w:val="20"/>
               </w:rPr>
-              <w:t>A count of 0, or a version of 2.6.1, means you are not on the right code. Run git branch --show-current and confirm it says beat-timing-fixes. Do not continue until all four checks pass.</w:t>
+              <w:t>The last one matters especially: a count of 0 there means you have the OLD installer script, which silently overwrites existing scenarios. See Part 5.</w:t>
             </w:r>
           </w:p>
         </w:tc>
@@ -2125,6 +2247,240 @@
         <w:t>Part 5 · Install it</w:t>
       </w:r>
     </w:p>
+    <w:tbl>
+      <w:tblPr>
+        <w:tblW w:type="auto" w:w="0"/>
+        <w:tblLook w:firstColumn="1" w:firstRow="1" w:lastColumn="0" w:lastRow="0" w:noHBand="0" w:noVBand="1" w:val="04A0"/>
+      </w:tblPr>
+      <w:tblGrid>
+        <w:gridCol w:w="9360"/>
+      </w:tblGrid>
+      <w:tr>
+        <w:tc>
+          <w:tcPr>
+            <w:tcW w:type="dxa" w:w="9360"/>
+            <w:shd w:val="clear" w:fill="FDECEA"/>
+            <w:tcBorders>
+              <w:top w:val="single" w:sz="2" w:color="C00000"/>
+              <w:bottom w:val="single" w:sz="2" w:color="C00000"/>
+              <w:left w:val="single" w:sz="24" w:color="C00000"/>
+              <w:right w:val="single" w:sz="2" w:color="C00000"/>
+            </w:tcBorders>
+          </w:tcPr>
+          <w:p>
+            <w:pPr>
+              <w:spacing w:after="80"/>
+            </w:pPr>
+            <w:r/>
+            <w:r>
+              <w:rPr>
+                <w:b/>
+                <w:color w:val="C00000"/>
+                <w:sz w:val="21"/>
+              </w:rPr>
+              <w:t>Read this before installing — scenarios were being destroyed</w:t>
+            </w:r>
+          </w:p>
+          <w:p>
+            <w:pPr>
+              <w:spacing w:after="60"/>
+            </w:pPr>
+            <w:r>
+              <w:rPr>
+                <w:sz w:val="20"/>
+              </w:rPr>
+              <w:t>Every previous installer silently overwrote scenarios in C:\Users\Public\OpenVetSim\scenarios that shared a name with a bundled one (default, healthy_dog, blank, Example_Scenario). No prompt, no backup. An instructor lost customised scenarios this way.</w:t>
+            </w:r>
+          </w:p>
+          <w:p>
+            <w:pPr>
+              <w:spacing w:after="0"/>
+            </w:pPr>
+            <w:r>
+              <w:rPr>
+                <w:sz w:val="20"/>
+              </w:rPr>
+              <w:t>v2.6.2 fixes it: it now backs up your scenarios first, then asks, with “keep mine” as the default button. Step 5.1 verifies the fix actually works before you trust it on a machine that matters.</w:t>
+            </w:r>
+          </w:p>
+        </w:tc>
+      </w:tr>
+    </w:tbl>
+    <w:p>
+      <w:pPr>
+        <w:spacing w:after="80"/>
+      </w:pPr>
+    </w:p>
+    <w:p>
+      <w:pPr>
+        <w:keepNext/>
+        <w:spacing w:before="260" w:after="100"/>
+      </w:pPr>
+      <w:r>
+        <w:rPr>
+          <w:b/>
+          <w:color w:val="2E75B6"/>
+          <w:sz w:val="24"/>
+        </w:rPr>
+        <w:t>5.1  Prove the scenario fix works (2 minutes)</w:t>
+      </w:r>
+    </w:p>
+    <w:p>
+      <w:pPr>
+        <w:spacing w:after="120"/>
+      </w:pPr>
+      <w:r>
+        <w:rPr>
+          <w:b w:val="0"/>
+          <w:i w:val="0"/>
+        </w:rPr>
+        <w:t>This has been checked logically but could not be tested on Windows here, so please confirm it yourself before installing anywhere important.</w:t>
+      </w:r>
+    </w:p>
+    <w:p>
+      <w:pPr>
+        <w:spacing w:after="80"/>
+        <w:ind w:left="403"/>
+      </w:pPr>
+      <w:r>
+        <w:rPr>
+          <w:sz w:val="24"/>
+        </w:rPr>
+        <w:t xml:space="preserve">☐  </w:t>
+      </w:r>
+      <w:r>
+        <w:rPr>
+          <w:sz w:val="21"/>
+        </w:rPr>
+        <w:t>Open C:\Users\Public\OpenVetSim\scenarios\default and make an obvious edit you will recognise — rename a file, or change a line in main.xml</w:t>
+      </w:r>
+    </w:p>
+    <w:p>
+      <w:pPr>
+        <w:spacing w:after="80"/>
+        <w:ind w:left="403"/>
+      </w:pPr>
+      <w:r>
+        <w:rPr>
+          <w:sz w:val="24"/>
+        </w:rPr>
+        <w:t xml:space="preserve">☐  </w:t>
+      </w:r>
+      <w:r>
+        <w:rPr>
+          <w:sz w:val="21"/>
+        </w:rPr>
+        <w:t>Run the installer</w:t>
+      </w:r>
+    </w:p>
+    <w:p>
+      <w:pPr>
+        <w:spacing w:after="80"/>
+        <w:ind w:left="403"/>
+      </w:pPr>
+      <w:r>
+        <w:rPr>
+          <w:sz w:val="24"/>
+        </w:rPr>
+        <w:t xml:space="preserve">☐  </w:t>
+      </w:r>
+      <w:r>
+        <w:rPr>
+          <w:sz w:val="21"/>
+        </w:rPr>
+        <w:t>A prompt should appear saying existing scenarios were found, with “No” already selected</w:t>
+      </w:r>
+    </w:p>
+    <w:p>
+      <w:pPr>
+        <w:spacing w:after="80"/>
+        <w:ind w:left="403"/>
+      </w:pPr>
+      <w:r>
+        <w:rPr>
+          <w:sz w:val="24"/>
+        </w:rPr>
+        <w:t xml:space="preserve">☐  </w:t>
+      </w:r>
+      <w:r>
+        <w:rPr>
+          <w:sz w:val="21"/>
+        </w:rPr>
+        <w:t>Press Enter without clicking anything</w:t>
+      </w:r>
+    </w:p>
+    <w:p>
+      <w:pPr>
+        <w:spacing w:after="80"/>
+        <w:ind w:left="403"/>
+      </w:pPr>
+      <w:r>
+        <w:rPr>
+          <w:sz w:val="24"/>
+        </w:rPr>
+        <w:t xml:space="preserve">☐  </w:t>
+      </w:r>
+      <w:r>
+        <w:rPr>
+          <w:sz w:val="21"/>
+        </w:rPr>
+        <w:t>Confirm your edit to ‘default’ survived</w:t>
+      </w:r>
+    </w:p>
+    <w:p>
+      <w:pPr>
+        <w:spacing w:after="80"/>
+        <w:ind w:left="403"/>
+      </w:pPr>
+      <w:r>
+        <w:rPr>
+          <w:sz w:val="24"/>
+        </w:rPr>
+        <w:t xml:space="preserve">☐  </w:t>
+      </w:r>
+      <w:r>
+        <w:rPr>
+          <w:sz w:val="21"/>
+        </w:rPr>
+        <w:t>Confirm a folder named scenarios-backup-&lt;date&gt;_&lt;time&gt; appeared alongside it</w:t>
+      </w:r>
+    </w:p>
+    <w:p>
+      <w:pPr>
+        <w:spacing w:after="120"/>
+      </w:pPr>
+    </w:p>
+    <w:p>
+      <w:pPr>
+        <w:spacing w:after="120"/>
+      </w:pPr>
+      <w:r>
+        <w:rPr>
+          <w:b/>
+        </w:rPr>
+        <w:t xml:space="preserve">If your edit was overwritten, stop and tell me. </w:t>
+      </w:r>
+      <w:r>
+        <w:rPr>
+          <w:b w:val="0"/>
+        </w:rPr>
+        <w:t>Everything else in this release is unaffected, but do not run the installer on a machine with scenarios you care about until that is sorted.</w:t>
+      </w:r>
+    </w:p>
+    <w:p>
+      <w:pPr>
+        <w:keepNext/>
+        <w:spacing w:before="260" w:after="100"/>
+      </w:pPr>
+      <w:r>
+        <w:rPr>
+          <w:b/>
+          <w:color w:val="2E75B6"/>
+          <w:sz w:val="24"/>
+        </w:rPr>
+        <w:t>5.2  Install</w:t>
+      </w:r>
+    </w:p>
     <w:p>
       <w:pPr>
         <w:spacing w:after="80"/>
@@ -2158,7 +2514,7 @@
         <w:rPr>
           <w:sz w:val="21"/>
         </w:rPr>
-        <w:t>Run dist\OpenVetSim Setup 2.6.2.exe</w:t>
+        <w:t>Run the installer:   &amp; ".\dist\OpenVetSim Setup 2.6.2.exe"</w:t>
       </w:r>
     </w:p>
     <w:p>
@@ -2177,6 +2533,24 @@
           <w:sz w:val="21"/>
         </w:rPr>
         <w:t>Click through the SmartScreen warning if it appears (More info, then Run anyway)</w:t>
+      </w:r>
+    </w:p>
+    <w:p>
+      <w:pPr>
+        <w:spacing w:after="80"/>
+        <w:ind w:left="403"/>
+      </w:pPr>
+      <w:r>
+        <w:rPr>
+          <w:sz w:val="24"/>
+        </w:rPr>
+        <w:t xml:space="preserve">☐  </w:t>
+      </w:r>
+      <w:r>
+        <w:rPr>
+          <w:sz w:val="21"/>
+        </w:rPr>
+        <w:t>Choose “No” at the scenarios prompt to keep your existing ones</w:t>
       </w:r>
     </w:p>
     <w:p>
@@ -2351,7 +2725,7 @@
                 <w:sz w:val="18"/>
                 <w:rFonts w:ascii="Consolas" w:hAnsi="Consolas"/>
               </w:rPr>
-              <w:t>cd $env:USERPROFILE\Documents\"Claude OVS"\OpenVetSim-App</w:t>
+              <w:t>cd "$env:USERPROFILE\Documents\Claude OVS\OpenVetSim-App"</w:t>
             </w:r>
           </w:p>
           <w:p>
@@ -2853,8 +3227,598 @@
       </w:r>
     </w:p>
     <w:p>
+      <w:pPr>
+        <w:keepNext/>
+        <w:spacing w:before="340" w:after="140"/>
+      </w:pPr>
       <w:r>
-        <w:br w:type="page"/>
+        <w:rPr>
+          <w:b/>
+          <w:color w:val="1F4E79"/>
+          <w:sz w:val="30"/>
+        </w:rPr>
+        <w:t>Part 6b · Optional: instructor interface from another computer</w:t>
+      </w:r>
+    </w:p>
+    <w:p>
+      <w:pPr>
+        <w:spacing w:after="120"/>
+      </w:pPr>
+      <w:r>
+        <w:rPr>
+          <w:b w:val="0"/>
+          <w:i w:val="0"/>
+        </w:rPr>
+        <w:t>Not required for Tuesday, but worth ten minutes if you have time. This is the setup that lets the server sit in the simulation room on wired Ethernet while you run the session from a laptop or tablet elsewhere — wire where timing matters, wireless where it does not.</w:t>
+      </w:r>
+    </w:p>
+    <w:p>
+      <w:pPr>
+        <w:keepNext/>
+        <w:spacing w:before="260" w:after="100"/>
+      </w:pPr>
+      <w:r>
+        <w:rPr>
+          <w:b/>
+          <w:color w:val="2E75B6"/>
+          <w:sz w:val="24"/>
+        </w:rPr>
+        <w:t>6b.1  Find the server’s address</w:t>
+      </w:r>
+    </w:p>
+    <w:p>
+      <w:pPr>
+        <w:spacing w:after="120"/>
+      </w:pPr>
+      <w:r>
+        <w:rPr>
+          <w:b w:val="0"/>
+          <w:i w:val="0"/>
+        </w:rPr>
+        <w:t>On the machine running OpenVetSim:</w:t>
+      </w:r>
+    </w:p>
+    <w:tbl>
+      <w:tblPr>
+        <w:tblW w:type="auto" w:w="0"/>
+        <w:jc w:val="left"/>
+        <w:tblLook w:firstColumn="1" w:firstRow="1" w:lastColumn="0" w:lastRow="0" w:noHBand="0" w:noVBand="1" w:val="04A0"/>
+      </w:tblPr>
+      <w:tblGrid>
+        <w:gridCol w:w="9360"/>
+      </w:tblGrid>
+      <w:tr>
+        <w:tc>
+          <w:tcPr>
+            <w:tcW w:type="dxa" w:w="9360"/>
+            <w:shd w:val="clear" w:fill="F2F2F2"/>
+            <w:tcBorders>
+              <w:top w:val="single" w:sz="2" w:color="D9D9D9"/>
+              <w:bottom w:val="single" w:sz="2" w:color="D9D9D9"/>
+              <w:left w:val="single" w:sz="18" w:color="2E75B6"/>
+              <w:right w:val="single" w:sz="2" w:color="D9D9D9"/>
+            </w:tcBorders>
+          </w:tcPr>
+          <w:p>
+            <w:pPr>
+              <w:spacing w:after="0" w:line="240" w:lineRule="auto"/>
+            </w:pPr>
+            <w:r/>
+            <w:r>
+              <w:rPr>
+                <w:rFonts w:ascii="Consolas" w:hAnsi="Consolas"/>
+                <w:sz w:val="18"/>
+                <w:rFonts w:ascii="Consolas" w:hAnsi="Consolas"/>
+              </w:rPr>
+              <w:t>ipconfig</w:t>
+            </w:r>
+          </w:p>
+        </w:tc>
+      </w:tr>
+    </w:tbl>
+    <w:p>
+      <w:pPr>
+        <w:spacing w:after="80"/>
+      </w:pPr>
+    </w:p>
+    <w:p>
+      <w:pPr>
+        <w:spacing w:after="120"/>
+      </w:pPr>
+      <w:r>
+        <w:rPr>
+          <w:b w:val="0"/>
+          <w:i w:val="0"/>
+        </w:rPr>
+        <w:t>Look for the IPv4 Address on your active adapter, e.g. 192.168.0.42.</w:t>
+      </w:r>
+    </w:p>
+    <w:p>
+      <w:pPr>
+        <w:spacing w:after="80"/>
+      </w:pPr>
+    </w:p>
+    <w:p>
+      <w:pPr>
+        <w:spacing w:after="120"/>
+      </w:pPr>
+      <w:r>
+        <w:rPr>
+          <w:b w:val="0"/>
+          <w:i/>
+          <w:color w:val="595959"/>
+        </w:rPr>
+        <w:t>Easier alternative: in OpenVetSim choose Simulator, then “Connect Phone or Tablet…”. The QR window shows the machine’s LAN address. Use the same address below, but note the port is different — that window shows the phone interface on port 40845, while the full instructor interface is on 8081.</w:t>
+      </w:r>
+    </w:p>
+    <w:p>
+      <w:pPr>
+        <w:keepNext/>
+        <w:spacing w:before="260" w:after="100"/>
+      </w:pPr>
+      <w:r>
+        <w:rPr>
+          <w:b/>
+          <w:color w:val="2E75B6"/>
+          <w:sz w:val="24"/>
+        </w:rPr>
+        <w:t>6b.2  Open it from the other computer</w:t>
+      </w:r>
+    </w:p>
+    <w:p>
+      <w:pPr>
+        <w:spacing w:after="120"/>
+      </w:pPr>
+      <w:r>
+        <w:rPr>
+          <w:b w:val="0"/>
+          <w:i w:val="0"/>
+        </w:rPr>
+        <w:t>In any browser on a machine on the same network:</w:t>
+      </w:r>
+    </w:p>
+    <w:tbl>
+      <w:tblPr>
+        <w:tblW w:type="auto" w:w="0"/>
+        <w:jc w:val="left"/>
+        <w:tblLook w:firstColumn="1" w:firstRow="1" w:lastColumn="0" w:lastRow="0" w:noHBand="0" w:noVBand="1" w:val="04A0"/>
+      </w:tblPr>
+      <w:tblGrid>
+        <w:gridCol w:w="9360"/>
+      </w:tblGrid>
+      <w:tr>
+        <w:tc>
+          <w:tcPr>
+            <w:tcW w:type="dxa" w:w="9360"/>
+            <w:shd w:val="clear" w:fill="F2F2F2"/>
+            <w:tcBorders>
+              <w:top w:val="single" w:sz="2" w:color="D9D9D9"/>
+              <w:bottom w:val="single" w:sz="2" w:color="D9D9D9"/>
+              <w:left w:val="single" w:sz="18" w:color="2E75B6"/>
+              <w:right w:val="single" w:sz="2" w:color="D9D9D9"/>
+            </w:tcBorders>
+          </w:tcPr>
+          <w:p>
+            <w:pPr>
+              <w:spacing w:after="0" w:line="240" w:lineRule="auto"/>
+            </w:pPr>
+            <w:r/>
+            <w:r>
+              <w:rPr>
+                <w:rFonts w:ascii="Consolas" w:hAnsi="Consolas"/>
+                <w:sz w:val="18"/>
+                <w:rFonts w:ascii="Consolas" w:hAnsi="Consolas"/>
+              </w:rPr>
+              <w:t>http://&lt;server-ip&gt;:8081/sim-ii/ii.php</w:t>
+            </w:r>
+          </w:p>
+          <w:p>
+            <w:pPr>
+              <w:spacing w:after="0" w:line="240" w:lineRule="auto"/>
+            </w:pPr>
+            <w:r>
+              <w:rPr>
+                <w:rFonts w:ascii="Consolas" w:hAnsi="Consolas"/>
+                <w:sz w:val="18"/>
+                <w:rFonts w:ascii="Consolas" w:hAnsi="Consolas"/>
+              </w:rPr>
+            </w:r>
+          </w:p>
+          <w:p>
+            <w:pPr>
+              <w:spacing w:after="0" w:line="240" w:lineRule="auto"/>
+            </w:pPr>
+            <w:r>
+              <w:rPr>
+                <w:rFonts w:ascii="Consolas" w:hAnsi="Consolas"/>
+                <w:sz w:val="18"/>
+                <w:rFonts w:ascii="Consolas" w:hAnsi="Consolas"/>
+              </w:rPr>
+              <w:t>for example:</w:t>
+            </w:r>
+          </w:p>
+          <w:p>
+            <w:pPr>
+              <w:spacing w:after="0" w:line="240" w:lineRule="auto"/>
+            </w:pPr>
+            <w:r>
+              <w:rPr>
+                <w:rFonts w:ascii="Consolas" w:hAnsi="Consolas"/>
+                <w:sz w:val="18"/>
+                <w:rFonts w:ascii="Consolas" w:hAnsi="Consolas"/>
+              </w:rPr>
+              <w:t>http://192.168.0.42:8081/sim-ii/ii.php</w:t>
+            </w:r>
+          </w:p>
+        </w:tc>
+      </w:tr>
+    </w:tbl>
+    <w:p>
+      <w:pPr>
+        <w:spacing w:after="80"/>
+      </w:pPr>
+    </w:p>
+    <w:p>
+      <w:pPr>
+        <w:keepNext/>
+        <w:spacing w:before="260" w:after="100"/>
+      </w:pPr>
+      <w:r>
+        <w:rPr>
+          <w:b/>
+          <w:color w:val="2E75B6"/>
+          <w:sz w:val="24"/>
+        </w:rPr>
+        <w:t>6b.3  If it does not load</w:t>
+      </w:r>
+    </w:p>
+    <w:p>
+      <w:pPr>
+        <w:spacing w:after="120"/>
+      </w:pPr>
+      <w:r>
+        <w:rPr>
+          <w:b w:val="0"/>
+          <w:i w:val="0"/>
+        </w:rPr>
+        <w:t>Work through these in order — each has caught us out at least once.</w:t>
+      </w:r>
+    </w:p>
+    <w:p>
+      <w:pPr>
+        <w:spacing w:after="80"/>
+      </w:pPr>
+    </w:p>
+    <w:p>
+      <w:pPr>
+        <w:spacing w:after="60"/>
+      </w:pPr>
+      <w:r>
+        <w:rPr>
+          <w:b/>
+          <w:i w:val="0"/>
+        </w:rPr>
+        <w:t>1.  winvetsim.ini pinning PHP to this machine only</w:t>
+      </w:r>
+    </w:p>
+    <w:p>
+      <w:pPr>
+        <w:spacing w:after="120"/>
+        <w:ind w:left="403"/>
+      </w:pPr>
+      <w:r>
+        <w:rPr>
+          <w:b w:val="0"/>
+          <w:i w:val="0"/>
+        </w:rPr>
+        <w:t>This affects every machine upgraded from an older version, and the failure is invisible locally. Check the log for a line beginning “NOTE: PHP is bound to 127.0.0.1”, or look at C:\Users\Public\OpenVetSim\winvetsim.ini. If serverAddress is 127.0.0.1, change it to 0.0.0.0 and restart OpenVetSim. The file is never touched by installers, so an old value persists indefinitely.</w:t>
+      </w:r>
+    </w:p>
+    <w:p>
+      <w:pPr>
+        <w:spacing w:after="60"/>
+      </w:pPr>
+    </w:p>
+    <w:p>
+      <w:pPr>
+        <w:spacing w:after="60"/>
+      </w:pPr>
+      <w:r>
+        <w:rPr>
+          <w:b/>
+          <w:i w:val="0"/>
+        </w:rPr>
+        <w:t>2.  Windows Firewall</w:t>
+      </w:r>
+    </w:p>
+    <w:p>
+      <w:pPr>
+        <w:spacing w:after="120"/>
+        <w:ind w:left="403"/>
+      </w:pPr>
+      <w:r>
+        <w:rPr>
+          <w:b w:val="0"/>
+          <w:i w:val="0"/>
+        </w:rPr>
+        <w:t>Allow ports 8081 and 40845 inbound. Note that PHP runs as a SEPARATE process (php.exe) from WinVetSim.exe, so it needs its own firewall permission — which is why 40845 can work while 8081 does not.</w:t>
+      </w:r>
+    </w:p>
+    <w:p>
+      <w:pPr>
+        <w:spacing w:after="60"/>
+      </w:pPr>
+    </w:p>
+    <w:p>
+      <w:pPr>
+        <w:spacing w:after="60"/>
+      </w:pPr>
+      <w:r>
+        <w:rPr>
+          <w:b/>
+          <w:i w:val="0"/>
+        </w:rPr>
+        <w:t>3.  Confirm from the command line before blaming the network</w:t>
+      </w:r>
+    </w:p>
+    <w:p>
+      <w:pPr>
+        <w:spacing w:after="120"/>
+        <w:ind w:left="403"/>
+      </w:pPr>
+      <w:r>
+        <w:rPr>
+          <w:b w:val="0"/>
+          <w:i w:val="0"/>
+        </w:rPr>
+        <w:t>From the other computer, bypass the browser entirely:</w:t>
+      </w:r>
+    </w:p>
+    <w:tbl>
+      <w:tblPr>
+        <w:tblW w:type="auto" w:w="0"/>
+        <w:jc w:val="left"/>
+        <w:tblLook w:firstColumn="1" w:firstRow="1" w:lastColumn="0" w:lastRow="0" w:noHBand="0" w:noVBand="1" w:val="04A0"/>
+      </w:tblPr>
+      <w:tblGrid>
+        <w:gridCol w:w="9360"/>
+      </w:tblGrid>
+      <w:tr>
+        <w:tc>
+          <w:tcPr>
+            <w:tcW w:type="dxa" w:w="9360"/>
+            <w:shd w:val="clear" w:fill="F2F2F2"/>
+            <w:tcBorders>
+              <w:top w:val="single" w:sz="2" w:color="D9D9D9"/>
+              <w:bottom w:val="single" w:sz="2" w:color="D9D9D9"/>
+              <w:left w:val="single" w:sz="18" w:color="2E75B6"/>
+              <w:right w:val="single" w:sz="2" w:color="D9D9D9"/>
+            </w:tcBorders>
+          </w:tcPr>
+          <w:p>
+            <w:pPr>
+              <w:spacing w:after="0" w:line="240" w:lineRule="auto"/>
+            </w:pPr>
+            <w:r/>
+            <w:r>
+              <w:rPr>
+                <w:rFonts w:ascii="Consolas" w:hAnsi="Consolas"/>
+                <w:sz w:val="18"/>
+                <w:rFonts w:ascii="Consolas" w:hAnsi="Consolas"/>
+              </w:rPr>
+              <w:t>curl -sI --max-time 5 http://&lt;server-ip&gt;:8081/sim-ii/ii.php</w:t>
+            </w:r>
+          </w:p>
+        </w:tc>
+      </w:tr>
+    </w:tbl>
+    <w:p>
+      <w:pPr>
+        <w:spacing w:after="80"/>
+      </w:pPr>
+    </w:p>
+    <w:p>
+      <w:pPr>
+        <w:spacing w:after="120"/>
+        <w:ind w:left="403"/>
+      </w:pPr>
+      <w:r>
+        <w:rPr>
+          <w:b w:val="0"/>
+          <w:i w:val="0"/>
+        </w:rPr>
+        <w:t>An HTTP/1.1 200 means the server is fine and the problem is the browser — most often a proxy, or on macOS Sequoia the Local Network permission (System Settings, Privacy &amp; Security, Local Network). Trying a different browser is a quick way to tell: if Safari works and Chrome does not, it is browser configuration, not your network.</w:t>
+      </w:r>
+    </w:p>
+    <w:p>
+      <w:pPr>
+        <w:spacing w:after="60"/>
+      </w:pPr>
+    </w:p>
+    <w:p>
+      <w:pPr>
+        <w:spacing w:after="60"/>
+      </w:pPr>
+      <w:r>
+        <w:rPr>
+          <w:b/>
+          <w:i w:val="0"/>
+        </w:rPr>
+        <w:t>4.  Do not trust ping</w:t>
+      </w:r>
+    </w:p>
+    <w:p>
+      <w:pPr>
+        <w:spacing w:after="120"/>
+        <w:ind w:left="403"/>
+      </w:pPr>
+      <w:r>
+        <w:rPr>
+          <w:b w:val="0"/>
+          <w:i w:val="0"/>
+        </w:rPr>
+        <w:t>Windows blocks ICMP echo by default, so a failed ping tells you nothing. Use curl.</w:t>
+      </w:r>
+    </w:p>
+    <w:p>
+      <w:pPr>
+        <w:spacing w:after="80"/>
+      </w:pPr>
+    </w:p>
+    <w:p>
+      <w:pPr>
+        <w:spacing w:after="120"/>
+      </w:pPr>
+      <w:r>
+        <w:rPr>
+          <w:b w:val="0"/>
+          <w:i w:val="0"/>
+        </w:rPr>
+        <w:t>Both ports are needed: 8081 serves the interface itself, and the page then fetches live data from 40845.</w:t>
+      </w:r>
+    </w:p>
+    <w:p>
+      <w:pPr>
+        <w:keepNext/>
+        <w:spacing w:before="260" w:after="100"/>
+      </w:pPr>
+      <w:r>
+        <w:rPr>
+          <w:b/>
+          <w:color w:val="2E75B6"/>
+          <w:sz w:val="24"/>
+        </w:rPr>
+        <w:t>6b.4  What to expect</w:t>
+      </w:r>
+    </w:p>
+    <w:p>
+      <w:pPr>
+        <w:spacing w:after="80"/>
+        <w:ind w:left="403"/>
+      </w:pPr>
+      <w:r>
+        <w:rPr>
+          <w:sz w:val="24"/>
+        </w:rPr>
+        <w:t xml:space="preserve">☐  </w:t>
+      </w:r>
+      <w:r>
+        <w:rPr>
+          <w:sz w:val="21"/>
+        </w:rPr>
+        <w:t>The instructor interface loads and you can log in</w:t>
+      </w:r>
+    </w:p>
+    <w:p>
+      <w:pPr>
+        <w:spacing w:after="80"/>
+        <w:ind w:left="403"/>
+      </w:pPr>
+      <w:r>
+        <w:rPr>
+          <w:sz w:val="24"/>
+        </w:rPr>
+        <w:t xml:space="preserve">☐  </w:t>
+      </w:r>
+      <w:r>
+        <w:rPr>
+          <w:sz w:val="21"/>
+        </w:rPr>
+        <w:t>Vitals update live and controls work</w:t>
+      </w:r>
+    </w:p>
+    <w:p>
+      <w:pPr>
+        <w:spacing w:after="80"/>
+        <w:ind w:left="403"/>
+      </w:pPr>
+      <w:r>
+        <w:rPr>
+          <w:sz w:val="24"/>
+        </w:rPr>
+        <w:t xml:space="preserve">☐  </w:t>
+      </w:r>
+      <w:r>
+        <w:rPr>
+          <w:sz w:val="21"/>
+        </w:rPr>
+        <w:t>The heart sound from the manikin is unaffected — it comes from the wired server, not from this browser</w:t>
+      </w:r>
+    </w:p>
+    <w:p>
+      <w:pPr>
+        <w:spacing w:after="120"/>
+      </w:pPr>
+    </w:p>
+    <w:tbl>
+      <w:tblPr>
+        <w:tblW w:type="auto" w:w="0"/>
+        <w:tblLook w:firstColumn="1" w:firstRow="1" w:lastColumn="0" w:lastRow="0" w:noHBand="0" w:noVBand="1" w:val="04A0"/>
+      </w:tblPr>
+      <w:tblGrid>
+        <w:gridCol w:w="9360"/>
+      </w:tblGrid>
+      <w:tr>
+        <w:tc>
+          <w:tcPr>
+            <w:tcW w:type="dxa" w:w="9360"/>
+            <w:shd w:val="clear" w:fill="EAF5EA"/>
+            <w:tcBorders>
+              <w:top w:val="single" w:sz="2" w:color="2E7D32"/>
+              <w:bottom w:val="single" w:sz="2" w:color="2E7D32"/>
+              <w:left w:val="single" w:sz="24" w:color="2E7D32"/>
+              <w:right w:val="single" w:sz="2" w:color="2E7D32"/>
+            </w:tcBorders>
+          </w:tcPr>
+          <w:p>
+            <w:pPr>
+              <w:spacing w:after="80"/>
+            </w:pPr>
+            <w:r/>
+            <w:r>
+              <w:rPr>
+                <w:b/>
+                <w:color w:val="2E7D32"/>
+                <w:sz w:val="21"/>
+              </w:rPr>
+              <w:t>Why this is worth trying</w:t>
+            </w:r>
+          </w:p>
+          <w:p>
+            <w:pPr>
+              <w:spacing w:after="0"/>
+            </w:pPr>
+            <w:r>
+              <w:rPr>
+                <w:sz w:val="20"/>
+              </w:rPr>
+              <w:t>The heart sound is driven by the server over its wired link to the controller, so it stays accurate no matter how the instructor interface is connected. A 60 ms Wi-Fi hiccup on a scrolling ECG trace or a slider is invisible; the same hiccup on a heart sound is the problem this whole release is about. Putting only the interface on Wi-Fi sidesteps it entirely.</w:t>
+            </w:r>
+          </w:p>
+        </w:tc>
+      </w:tr>
+    </w:tbl>
+    <w:p>
+      <w:pPr>
+        <w:spacing w:after="80"/>
+      </w:pPr>
+    </w:p>
+    <w:p>
+      <w:pPr>
+        <w:spacing w:after="80"/>
+      </w:pPr>
+    </w:p>
+    <w:p>
+      <w:pPr>
+        <w:spacing w:after="120"/>
+      </w:pPr>
+      <w:r>
+        <w:rPr>
+          <w:b w:val="0"/>
+          <w:i/>
+          <w:color w:val="595959"/>
+        </w:rPr>
+        <w:t>One known gap: OBS recording start/stop will not work from a remote browser yet. The code connects to OBS at ‘localhost’, which from a remote browser means that browser’s own machine rather than the server. It fails silently. Everything else works; this is a small fix for when you actually need it.</w:t>
       </w:r>
     </w:p>
     <w:p>
@@ -2967,7 +3931,7 @@
                 <w:sz w:val="18"/>
                 <w:rFonts w:ascii="Consolas" w:hAnsi="Consolas"/>
               </w:rPr>
-              <w:t>$env:USERPROFILE\Desktop\OpenVetSim-rollback\"OpenVetSim Setup 2.6.1.exe"</w:t>
+              <w:t>&amp; "$env:USERPROFILE\Desktop\OpenVetSim-rollback\OpenVetSim Setup 2.6.1.exe"</w:t>
             </w:r>
           </w:p>
         </w:tc>
@@ -3144,7 +4108,7 @@
                 <w:sz w:val="18"/>
                 <w:rFonts w:ascii="Consolas" w:hAnsi="Consolas"/>
               </w:rPr>
-              <w:t>cd $env:USERPROFILE\Documents\"Claude OVS"</w:t>
+              <w:t>cd "$env:USERPROFILE\Documents\Claude OVS"</w:t>
             </w:r>
           </w:p>
           <w:p>

</xml_diff>